<commit_message>
Show VP of Paid Media since 2017 and the team built from one person
Drops the title history. elk since 2017 as VP of Paid Media; the
department started as one person and was built from there. Updated on
the homepage, the team page and the resume.

Co-Authored-By: Claude Opus 5.5 <noreply@anthropic.com>
</commit_message>
<xml_diff>
--- a/downloads/James_Dupre_AI_Strategy_Operations_Master.docx
+++ b/downloads/James_Dupre_AI_Strategy_Operations_Master.docx
@@ -204,7 +204,7 @@
           <w:sz w:val="22"/>
           <w:u w:val="none"/>
         </w:rPr>
-        <w:t>VP of Paid Media, Apr 2026–Present | Director, 2020–2026 | Analytics, Jul 2017–2019</w:t>
+        <w:t>VP of Paid Media | July 2017–Present | Remote</w:t>
       </w:r>
     </w:p>
     <w:p>
@@ -223,7 +223,7 @@
           <w:sz w:val="22"/>
           <w:u w:val="none"/>
         </w:rPr>
-        <w:t xml:space="preserve">Lead </w:t>
+        <w:t xml:space="preserve">Built the paid-media department from a team of one. Lead </w:t>
       </w:r>
       <w:r>
         <w:rPr>

</xml_diff>

<commit_message>
Rewrite resume copy to match the portfolio story
VP of Paid Media since 2017, department built from a team of one,
AdNexus with verified scope, team standards, Compartés award with role,
other builds, compressed earlier roles. Same two-page Arial design.

Co-Authored-By: Claude Opus 5.5 <noreply@anthropic.com>
</commit_message>
<xml_diff>
--- a/downloads/James_Dupre_AI_Strategy_Operations_Master.docx
+++ b/downloads/James_Dupre_AI_Strategy_Operations_Master.docx
@@ -37,7 +37,7 @@
           <w:sz w:val="24"/>
           <w:u w:val="none"/>
         </w:rPr>
-        <w:t>AI Strategy and Operations | Paid Media Leadership</w:t>
+        <w:t>VP of Paid Media | Built AdNexus, an AI Operating System for Paid Media</w:t>
       </w:r>
     </w:p>
     <w:p>
@@ -147,7 +147,7 @@
           <w:sz w:val="22"/>
           <w:u w:val="none"/>
         </w:rPr>
-        <w:t>Paid-media executive who builds AI products from hands-on operating experience. Created AdNexus and the training, review processes and account-ownership practices that help agency teams use it. Combines product development and people leadership with commercial experience across paid acquisition, ecommerce and conversion improvement.</w:t>
+        <w:t>Paid-media leader with 20 years in digital marketing. Joined elk Marketing in 2017 as its only paid-media person and built the department to six strategists and approximately $100M in annual client media spend. In 2026 built AdNexus, the AI operating system the team now uses on live client accounts, from the same written standard every strategist is trained on.</w:t>
       </w:r>
     </w:p>
     <w:p>
@@ -223,7 +223,31 @@
           <w:sz w:val="22"/>
           <w:u w:val="none"/>
         </w:rPr>
-        <w:t xml:space="preserve">Built the paid-media department from a team of one. Lead </w:t>
+        <w:t xml:space="preserve">Built the paid-media department from a </w:t>
+      </w:r>
+      <w:r>
+        <w:rPr>
+          <w:rFonts w:ascii="Arial" w:hAnsi="Arial" w:cs="Arial" w:eastAsia="Arial"/>
+          <w:b/>
+          <w:i w:val="0"/>
+          <w:smallCaps w:val="0"/>
+          <w:color w:val="202729"/>
+          <w:sz w:val="22"/>
+          <w:u w:val="none"/>
+        </w:rPr>
+        <w:t>team of one</w:t>
+      </w:r>
+      <w:r>
+        <w:rPr>
+          <w:rFonts w:ascii="Arial" w:hAnsi="Arial" w:cs="Arial" w:eastAsia="Arial"/>
+          <w:b w:val="0"/>
+          <w:i w:val="0"/>
+          <w:smallCaps w:val="0"/>
+          <w:color w:val="202729"/>
+          <w:sz w:val="22"/>
+          <w:u w:val="none"/>
+        </w:rPr>
+        <w:t xml:space="preserve">. Lead </w:t>
       </w:r>
       <w:r>
         <w:rPr>
@@ -247,7 +271,7 @@
           <w:sz w:val="22"/>
           <w:u w:val="none"/>
         </w:rPr>
-        <w:t xml:space="preserve"> and paid-media department operations across a portfolio of </w:t>
+        <w:t xml:space="preserve"> and department operations across </w:t>
       </w:r>
       <w:r>
         <w:rPr>
@@ -271,14 +295,14 @@
           <w:sz w:val="22"/>
           <w:u w:val="none"/>
         </w:rPr>
-        <w:t xml:space="preserve"> in annual media spend. Oversee strategist development, quality standards and selected client strategy.</w:t>
+        <w:t xml:space="preserve"> in annual client media spend, and still work directly on selected accounts.</w:t>
       </w:r>
     </w:p>
     <w:p>
       <w:pPr>
-        <w:keepNext w:val="0"/>
+        <w:keepNext/>
         <w:widowControl/>
-        <w:spacing w:before="42" w:after="60" w:line="247" w:lineRule="auto"/>
+        <w:spacing w:before="90" w:after="48" w:line="247" w:lineRule="auto"/>
       </w:pPr>
       <w:r>
         <w:rPr>
@@ -290,8 +314,15 @@
           <w:sz w:val="22"/>
           <w:u w:val="none"/>
         </w:rPr>
-        <w:t>Conceived and built AdNexus, elk Marketing’s proprietary AI operating system for paid media.</w:t>
+        <w:t>AdNexus: AI operating system for paid media</w:t>
       </w:r>
+    </w:p>
+    <w:p>
+      <w:pPr>
+        <w:keepNext w:val="0"/>
+        <w:widowControl/>
+        <w:spacing w:before="0" w:after="60" w:line="247" w:lineRule="auto"/>
+      </w:pPr>
       <w:r>
         <w:rPr>
           <w:rFonts w:ascii="Arial" w:hAnsi="Arial" w:cs="Arial" w:eastAsia="Arial"/>
@@ -302,7 +333,7 @@
           <w:sz w:val="22"/>
           <w:u w:val="none"/>
         </w:rPr>
-        <w:t xml:space="preserve"> Connected client intelligence and agency expertise to strategy, analysis, reporting, creative development, campaign creation and optimization, giving strategists and cross-functional teams a shared system for moving from account context to reviewed execution.</w:t>
+        <w:t>Conceived, specified and built AdNexus with Claude Code and Codex. It connects Google Ads, Meta, TikTok, Microsoft Advertising, GA4, Triple Whale, Slack, Asana and meeting notes. Strategists ask in plain English and get a sourced answer, a dashboard or a change ready for approval.</w:t>
       </w:r>
     </w:p>
     <w:p>
@@ -357,7 +388,7 @@
           <w:sz w:val="22"/>
           <w:u w:val="none"/>
         </w:rPr>
-        <w:t xml:space="preserve"> through AdNexus, enabling greater account ownership with less manual work and stress.</w:t>
+        <w:t xml:space="preserve"> by replacing manual fact-gathering with 18 scheduled monitors and reports, including search-term control, ad-copy and landing-page QA, budget pacing, Meta Investigator and Creative Confidence.</w:t>
       </w:r>
     </w:p>
     <w:p>
@@ -388,7 +419,7 @@
           <w:sz w:val="22"/>
           <w:u w:val="none"/>
         </w:rPr>
-        <w:t xml:space="preserve">Developed an applied strategist curriculum with onboarding, practice exercises and review criteria. Codified paid-media methods in the Ad Training Library and a </w:t>
+        <w:t xml:space="preserve">Shipped </w:t>
       </w:r>
       <w:r>
         <w:rPr>
@@ -400,7 +431,7 @@
           <w:sz w:val="22"/>
           <w:u w:val="none"/>
         </w:rPr>
-        <w:t>200+ page guide</w:t>
+        <w:t>860 merged pull requests</w:t>
       </w:r>
       <w:r>
         <w:rPr>
@@ -412,7 +443,7 @@
           <w:sz w:val="22"/>
           <w:u w:val="none"/>
         </w:rPr>
-        <w:t>, then integrated relevant guidance into AdNexus analysis and creative generation.</w:t>
+        <w:t xml:space="preserve"> between July 15 and October 12, 2026, through CI on a protected main branch. Exposed 165 tools to AI assistants through an MCP server, across 34 clients.</w:t>
       </w:r>
     </w:p>
     <w:p>
@@ -443,26 +474,7 @@
           <w:sz w:val="22"/>
           <w:u w:val="none"/>
         </w:rPr>
-        <w:t>Built validation, approval and verification into supported account workflows: check assets and settings, review proposed changes before execution, confirm results afterward and retain an audit trail with recovery options.</w:t>
-      </w:r>
-    </w:p>
-    <w:p>
-      <w:pPr>
-        <w:keepNext/>
-        <w:widowControl/>
-        <w:spacing w:before="90" w:after="48" w:line="247" w:lineRule="auto"/>
-      </w:pPr>
-      <w:r>
-        <w:rPr>
-          <w:rFonts w:ascii="Arial" w:hAnsi="Arial" w:cs="Arial" w:eastAsia="Arial"/>
-          <w:b/>
-          <w:i w:val="0"/>
-          <w:smallCaps w:val="0"/>
-          <w:color w:val="202729"/>
-          <w:sz w:val="22"/>
-          <w:u w:val="none"/>
-        </w:rPr>
-        <w:t>Department leadership and account performance</w:t>
+        <w:t>Put every account change behind one gate: preview, approval, live re-check, single dispatch, read-back, audit log and undo. New campaigns and ads are created paused.</w:t>
       </w:r>
     </w:p>
     <w:p>
@@ -493,7 +505,50 @@
           <w:sz w:val="22"/>
           <w:u w:val="none"/>
         </w:rPr>
-        <w:t>Designed hiring, onboarding, training, QA, reporting and account-ownership practices; develop strategists through clear expectations, practical guidance and review of account work.</w:t>
+        <w:t xml:space="preserve">Automated campaign building: </w:t>
+      </w:r>
+      <w:r>
+        <w:rPr>
+          <w:rFonts w:ascii="Arial" w:hAnsi="Arial" w:cs="Arial" w:eastAsia="Arial"/>
+          <w:b/>
+          <w:i w:val="0"/>
+          <w:smallCaps w:val="0"/>
+          <w:color w:val="202729"/>
+          <w:sz w:val="22"/>
+          <w:u w:val="none"/>
+        </w:rPr>
+        <w:t>approximately 100 ads in 2 minutes</w:t>
+      </w:r>
+      <w:r>
+        <w:rPr>
+          <w:rFonts w:ascii="Arial" w:hAnsi="Arial" w:cs="Arial" w:eastAsia="Arial"/>
+          <w:b w:val="0"/>
+          <w:i w:val="0"/>
+          <w:smallCaps w:val="0"/>
+          <w:color w:val="202729"/>
+          <w:sz w:val="22"/>
+          <w:u w:val="none"/>
+        </w:rPr>
+        <w:t xml:space="preserve"> versus 2–3 minutes per ad by hand, and Google Performance Max campaigns built in about 2 minutes, ready for launch review.</w:t>
+      </w:r>
+    </w:p>
+    <w:p>
+      <w:pPr>
+        <w:keepNext/>
+        <w:widowControl/>
+        <w:spacing w:before="90" w:after="48" w:line="247" w:lineRule="auto"/>
+      </w:pPr>
+      <w:r>
+        <w:rPr>
+          <w:rFonts w:ascii="Arial" w:hAnsi="Arial" w:cs="Arial" w:eastAsia="Arial"/>
+          <w:b/>
+          <w:i w:val="0"/>
+          <w:smallCaps w:val="0"/>
+          <w:color w:val="202729"/>
+          <w:sz w:val="22"/>
+          <w:u w:val="none"/>
+        </w:rPr>
+        <w:t>Team and standards</w:t>
       </w:r>
     </w:p>
     <w:p>
@@ -524,7 +579,93 @@
           <w:sz w:val="22"/>
           <w:u w:val="none"/>
         </w:rPr>
-        <w:t>Built reporting that connects revenue, attribution, customer mix, creative learning and account risks to growth plans and budget recommendations; coordinate decisions with account, creative, project‑management and executive teams.</w:t>
+        <w:t>Created hiring, onboarding and review from scratch: panel interviews, test projects and scorecards, biweekly 1:1s, monthly account audits and a weekly paid-media roundtable.</w:t>
+      </w:r>
+    </w:p>
+    <w:p>
+      <w:pPr>
+        <w:widowControl/>
+        <w:spacing w:before="0" w:after="48" w:line="247" w:lineRule="auto"/>
+        <w:ind w:left="274" w:hanging="274"/>
+      </w:pPr>
+      <w:r>
+        <w:rPr>
+          <w:rFonts w:ascii="Arial" w:hAnsi="Arial" w:cs="Arial" w:eastAsia="Arial"/>
+          <w:b w:val="0"/>
+          <w:i w:val="0"/>
+          <w:smallCaps w:val="0"/>
+          <w:color w:val="155C58"/>
+          <w:sz w:val="22"/>
+          <w:u w:val="none"/>
+        </w:rPr>
+        <w:t xml:space="preserve">• </w:t>
+      </w:r>
+      <w:r>
+        <w:rPr>
+          <w:rFonts w:ascii="Arial" w:hAnsi="Arial" w:cs="Arial" w:eastAsia="Arial"/>
+          <w:b w:val="0"/>
+          <w:i w:val="0"/>
+          <w:smallCaps w:val="0"/>
+          <w:color w:val="202729"/>
+          <w:sz w:val="22"/>
+          <w:u w:val="none"/>
+        </w:rPr>
+        <w:t xml:space="preserve">Wrote the </w:t>
+      </w:r>
+      <w:r>
+        <w:rPr>
+          <w:rFonts w:ascii="Arial" w:hAnsi="Arial" w:cs="Arial" w:eastAsia="Arial"/>
+          <w:b/>
+          <w:i w:val="0"/>
+          <w:smallCaps w:val="0"/>
+          <w:color w:val="202729"/>
+          <w:sz w:val="22"/>
+          <w:u w:val="none"/>
+        </w:rPr>
+        <w:t>200+ page guide</w:t>
+      </w:r>
+      <w:r>
+        <w:rPr>
+          <w:rFonts w:ascii="Arial" w:hAnsi="Arial" w:cs="Arial" w:eastAsia="Arial"/>
+          <w:b w:val="0"/>
+          <w:i w:val="0"/>
+          <w:smallCaps w:val="0"/>
+          <w:color w:val="202729"/>
+          <w:sz w:val="22"/>
+          <w:u w:val="none"/>
+        </w:rPr>
+        <w:t xml:space="preserve"> to audits, optimization and training, and the Ad Training Library of playbooks and exercises, then built the same guidance into AdNexus analysis and creative work.</w:t>
+      </w:r>
+    </w:p>
+    <w:p>
+      <w:pPr>
+        <w:widowControl/>
+        <w:spacing w:before="0" w:after="48" w:line="247" w:lineRule="auto"/>
+        <w:ind w:left="274" w:hanging="274"/>
+      </w:pPr>
+      <w:r>
+        <w:rPr>
+          <w:rFonts w:ascii="Arial" w:hAnsi="Arial" w:cs="Arial" w:eastAsia="Arial"/>
+          <w:b w:val="0"/>
+          <w:i w:val="0"/>
+          <w:smallCaps w:val="0"/>
+          <w:color w:val="155C58"/>
+          <w:sz w:val="22"/>
+          <w:u w:val="none"/>
+        </w:rPr>
+        <w:t xml:space="preserve">• </w:t>
+      </w:r>
+      <w:r>
+        <w:rPr>
+          <w:rFonts w:ascii="Arial" w:hAnsi="Arial" w:cs="Arial" w:eastAsia="Arial"/>
+          <w:b w:val="0"/>
+          <w:i w:val="0"/>
+          <w:smallCaps w:val="0"/>
+          <w:color w:val="202729"/>
+          <w:sz w:val="22"/>
+          <w:u w:val="none"/>
+        </w:rPr>
+        <w:t>Set the team’s AI standard and training path, beginner to advanced: plan the work, get a person’s approval, verify against real account numbers.</w:t>
       </w:r>
     </w:p>
     <w:p>
@@ -579,69 +720,7 @@
           <w:sz w:val="22"/>
           <w:u w:val="none"/>
         </w:rPr>
-        <w:t xml:space="preserve"> on selected accounts by combining paid-media expertise with AI-assisted analysis, AdNexus workflows, and campaign optimization.</w:t>
-      </w:r>
-    </w:p>
-    <w:p>
-      <w:pPr>
-        <w:keepNext/>
-        <w:widowControl/>
-        <w:spacing w:before="90" w:after="48" w:line="247" w:lineRule="auto"/>
-      </w:pPr>
-      <w:r>
-        <w:rPr>
-          <w:rFonts w:ascii="Arial" w:hAnsi="Arial" w:cs="Arial" w:eastAsia="Arial"/>
-          <w:b/>
-          <w:i w:val="0"/>
-          <w:smallCaps w:val="0"/>
-          <w:color w:val="202729"/>
-          <w:sz w:val="22"/>
-          <w:u w:val="none"/>
-        </w:rPr>
-        <w:t>Meta Agency Award</w:t>
-      </w:r>
-    </w:p>
-    <w:p>
-      <w:pPr>
-        <w:keepNext w:val="0"/>
-        <w:widowControl/>
-        <w:spacing w:before="0" w:after="0" w:line="247" w:lineRule="auto"/>
-      </w:pPr>
-      <w:r>
-        <w:rPr>
-          <w:rFonts w:ascii="Arial" w:hAnsi="Arial" w:cs="Arial" w:eastAsia="Arial"/>
-          <w:b w:val="0"/>
-          <w:i w:val="0"/>
-          <w:smallCaps w:val="0"/>
-          <w:color w:val="202729"/>
-          <w:sz w:val="22"/>
-          <w:u w:val="none"/>
-        </w:rPr>
-        <w:t xml:space="preserve">Helped lead the elk Marketing team behind Compartés’ 2025 holiday campaign, winner of the 2026 Meta Agency Award for Performance Campaign of the Year by a Boutique Agency in North America. The campaign delivered 56% year-over-year website-sales growth and </w:t>
-      </w:r>
-      <w:r>
-        <w:rPr>
-          <w:rFonts w:ascii="Arial" w:hAnsi="Arial" w:cs="Arial" w:eastAsia="Arial"/>
-          <w:b/>
-          <w:i w:val="0"/>
-          <w:smallCaps w:val="0"/>
-          <w:color w:val="202729"/>
-          <w:sz w:val="22"/>
-          <w:u w:val="none"/>
-        </w:rPr>
-        <w:t>4.26x Meta ROAS</w:t>
-      </w:r>
-      <w:r>
-        <w:rPr>
-          <w:rFonts w:ascii="Arial" w:hAnsi="Arial" w:cs="Arial" w:eastAsia="Arial"/>
-          <w:b w:val="0"/>
-          <w:i w:val="0"/>
-          <w:smallCaps w:val="0"/>
-          <w:color w:val="202729"/>
-          <w:sz w:val="22"/>
-          <w:u w:val="none"/>
-        </w:rPr>
-        <w:t>.</w:t>
+        <w:t xml:space="preserve"> on selected accounts by combining paid-media expertise with AI-assisted analysis, AdNexus workflows and campaign optimization.</w:t>
       </w:r>
     </w:p>
     <w:p>
@@ -687,26 +766,7 @@
           <w:sz w:val="20"/>
           <w:u w:val="none"/>
         </w:rPr>
-        <w:t>AI Strategy and Operations | Paid Media Leadership</w:t>
-      </w:r>
-    </w:p>
-    <w:p>
-      <w:pPr>
-        <w:keepNext/>
-        <w:widowControl/>
-        <w:spacing w:before="0" w:after="60" w:line="247" w:lineRule="auto"/>
-      </w:pPr>
-      <w:r>
-        <w:rPr>
-          <w:rFonts w:ascii="Arial" w:hAnsi="Arial" w:cs="Arial" w:eastAsia="Arial"/>
-          <w:b w:val="0"/>
-          <w:i/>
-          <w:smallCaps w:val="0"/>
-          <w:color w:val="202729"/>
-          <w:sz w:val="22"/>
-          <w:u w:val="none"/>
-        </w:rPr>
-        <w:t>elk Marketing | VP of Paid Media, continued</w:t>
+        <w:t>VP of Paid Media | Built AdNexus, an AI Operating System for Paid Media</w:t>
       </w:r>
     </w:p>
     <w:p>
@@ -725,14 +785,14 @@
           <w:sz w:val="26"/>
           <w:u w:val="none"/>
         </w:rPr>
-        <w:t>AdNexus Campaign Execution</w:t>
+        <w:t>Meta Agency Award</w:t>
       </w:r>
     </w:p>
     <w:p>
       <w:pPr>
+        <w:keepNext w:val="0"/>
         <w:widowControl/>
-        <w:spacing w:before="0" w:after="48" w:line="247" w:lineRule="auto"/>
-        <w:ind w:left="274" w:hanging="274"/>
+        <w:spacing w:before="0" w:after="60" w:line="247" w:lineRule="auto"/>
       </w:pPr>
       <w:r>
         <w:rPr>
@@ -740,11 +800,23 @@
           <w:b w:val="0"/>
           <w:i w:val="0"/>
           <w:smallCaps w:val="0"/>
-          <w:color w:val="155C58"/>
+          <w:color w:val="202729"/>
           <w:sz w:val="22"/>
           <w:u w:val="none"/>
         </w:rPr>
-        <w:t xml:space="preserve">• </w:t>
+        <w:t xml:space="preserve">Helped lead the elk team behind Compartés’ 2025 holiday campaign, winner of the 2026 Meta Agency Award for Performance Campaign of the Year by a Boutique Agency in North America. Created the $200,000 five-stage Meta budget plan, set the weekly budget steps and wrote the award submission. The campaign delivered </w:t>
+      </w:r>
+      <w:r>
+        <w:rPr>
+          <w:rFonts w:ascii="Arial" w:hAnsi="Arial" w:cs="Arial" w:eastAsia="Arial"/>
+          <w:b/>
+          <w:i w:val="0"/>
+          <w:smallCaps w:val="0"/>
+          <w:color w:val="202729"/>
+          <w:sz w:val="22"/>
+          <w:u w:val="none"/>
+        </w:rPr>
+        <w:t>56% year-over-year website-sales growth</w:t>
       </w:r>
       <w:r>
         <w:rPr>
@@ -756,7 +828,7 @@
           <w:sz w:val="22"/>
           <w:u w:val="none"/>
         </w:rPr>
-        <w:t xml:space="preserve">Automated campaign creation and ad uploads: </w:t>
+        <w:t xml:space="preserve"> and </w:t>
       </w:r>
       <w:r>
         <w:rPr>
@@ -768,7 +840,7 @@
           <w:sz w:val="22"/>
           <w:u w:val="none"/>
         </w:rPr>
-        <w:t>approximately 100 ads in 2 minutes</w:t>
+        <w:t>4.26x Meta ROAS</w:t>
       </w:r>
       <w:r>
         <w:rPr>
@@ -780,7 +852,7 @@
           <w:sz w:val="22"/>
           <w:u w:val="none"/>
         </w:rPr>
-        <w:t xml:space="preserve"> versus 2–3 minutes per ad manually; build Google Performance Max campaigns in approximately 2 minutes, ready for launch review.</w:t>
+        <w:t>.</w:t>
       </w:r>
     </w:p>
     <w:p>
@@ -799,7 +871,45 @@
           <w:sz w:val="26"/>
           <w:u w:val="none"/>
         </w:rPr>
-        <w:t>Additional AI Systems</w:t>
+        <w:t>Other Builds</w:t>
+      </w:r>
+    </w:p>
+    <w:p>
+      <w:pPr>
+        <w:keepNext/>
+        <w:widowControl/>
+        <w:spacing w:before="90" w:after="48" w:line="247" w:lineRule="auto"/>
+      </w:pPr>
+      <w:r>
+        <w:rPr>
+          <w:rFonts w:ascii="Arial" w:hAnsi="Arial" w:cs="Arial" w:eastAsia="Arial"/>
+          <w:b/>
+          <w:i w:val="0"/>
+          <w:smallCaps w:val="0"/>
+          <w:color w:val="202729"/>
+          <w:sz w:val="22"/>
+          <w:u w:val="none"/>
+        </w:rPr>
+        <w:t>Summoner | AI harness in development</w:t>
+      </w:r>
+    </w:p>
+    <w:p>
+      <w:pPr>
+        <w:keepNext w:val="0"/>
+        <w:widowControl/>
+        <w:spacing w:before="0" w:after="70" w:line="247" w:lineRule="auto"/>
+      </w:pPr>
+      <w:r>
+        <w:rPr>
+          <w:rFonts w:ascii="Arial" w:hAnsi="Arial" w:cs="Arial" w:eastAsia="Arial"/>
+          <w:b w:val="0"/>
+          <w:i w:val="0"/>
+          <w:smallCaps w:val="0"/>
+          <w:color w:val="202729"/>
+          <w:sz w:val="22"/>
+          <w:u w:val="none"/>
+        </w:rPr>
+        <w:t>Desktop app for directing several AI coding agents on one project. Each agent starts with the project context it needs, a second model can review its work, and nothing is kept without approval.</w:t>
       </w:r>
     </w:p>
     <w:p>
@@ -837,7 +947,7 @@
           <w:sz w:val="22"/>
           <w:u w:val="none"/>
         </w:rPr>
-        <w:t>Built a searchable private knowledge system that preserves project history, decisions, evidence, instructions and next steps across sessions. Defined how information is sourced, verified, updated and retrieved, with privacy controls and explicit treatment of contradictions and incomplete coverage. Gives AI assistants useful working context without treating every new input as trusted knowledge.</w:t>
+        <w:t>Private knowledge system for project history, decisions, sources and working rules. New information waits for review before an assistant can rely on it, so context carries across sessions.</w:t>
       </w:r>
     </w:p>
     <w:p>
@@ -856,7 +966,7 @@
           <w:sz w:val="22"/>
           <w:u w:val="none"/>
         </w:rPr>
-        <w:t>Summoner | AI harness in development</w:t>
+        <w:t>Snipping Tool UL | public Windows app in Rust</w:t>
       </w:r>
     </w:p>
     <w:p>
@@ -875,7 +985,7 @@
           <w:sz w:val="22"/>
           <w:u w:val="none"/>
         </w:rPr>
-        <w:t>Developing Summoner, a desktop AI harness for directing models, project context, tasks and outputs, with inspectable memory, deliberate cross-model critique, and review controls designed around existing AI workflows.</w:t>
+        <w:t>Lightweight screenshot and markup tool. A cached-viewport renderer cut preview render time 61% on a 4K image while keeping full-resolution exports.</w:t>
       </w:r>
     </w:p>
     <w:p>
@@ -894,7 +1004,7 @@
           <w:sz w:val="26"/>
           <w:u w:val="none"/>
         </w:rPr>
-        <w:t>Earlier Professional Experience</w:t>
+        <w:t>Earlier Experience</w:t>
       </w:r>
     </w:p>
     <w:p>
@@ -951,7 +1061,7 @@
           <w:sz w:val="22"/>
           <w:u w:val="none"/>
         </w:rPr>
-        <w:t xml:space="preserve">Consulting across paid acquisition and conversion improvement, including work concurrent with elk. </w:t>
+        <w:t xml:space="preserve">Contract consulting across paid acquisition and conversion, alongside elk from 2017. </w:t>
       </w:r>
       <w:r>
         <w:rPr>
@@ -1032,7 +1142,7 @@
           <w:sz w:val="22"/>
           <w:u w:val="none"/>
         </w:rPr>
-        <w:t xml:space="preserve">Led ecommerce and paid-search marketing; developed product bundles with sales that increased average order value by </w:t>
+        <w:t xml:space="preserve">Led ecommerce and paid-search marketing. Developed product bundles that increased average order value by </w:t>
       </w:r>
       <w:r>
         <w:rPr>
@@ -1075,15 +1185,27 @@
           <w:sz w:val="26"/>
           <w:u w:val="none"/>
         </w:rPr>
-        <w:t>Core Capabilities</w:t>
+        <w:t>Skills</w:t>
       </w:r>
     </w:p>
     <w:p>
       <w:pPr>
         <w:keepNext w:val="0"/>
         <w:widowControl/>
-        <w:spacing w:before="0" w:after="60" w:line="247" w:lineRule="auto"/>
+        <w:spacing w:before="0" w:after="52" w:line="247" w:lineRule="auto"/>
       </w:pPr>
+      <w:r>
+        <w:rPr>
+          <w:rFonts w:ascii="Arial" w:hAnsi="Arial" w:cs="Arial" w:eastAsia="Arial"/>
+          <w:b/>
+          <w:i w:val="0"/>
+          <w:smallCaps w:val="0"/>
+          <w:color w:val="202729"/>
+          <w:sz w:val="22"/>
+          <w:u w:val="none"/>
+        </w:rPr>
+        <w:t>Paid media:</w:t>
+      </w:r>
       <w:r>
         <w:rPr>
           <w:rFonts w:ascii="Arial" w:hAnsi="Arial" w:cs="Arial" w:eastAsia="Arial"/>
@@ -1094,14 +1216,14 @@
           <w:sz w:val="22"/>
           <w:u w:val="none"/>
         </w:rPr>
-        <w:t>AI product and workflow development; product requirements; team development; knowledge and context systems; marketing analytics; campaign optimization; cross-functional operations; quality standards and review controls; API and MCP integrations.</w:t>
+        <w:t xml:space="preserve"> Google Ads (Search, Shopping, Performance Max, Demand Gen, YouTube), Meta Ads, TikTok, Microsoft Advertising; GA4, Google Tag Manager, Triple Whale, Looker Studio, Shopify; attribution, budget forecasting and pacing.</w:t>
       </w:r>
     </w:p>
     <w:p>
       <w:pPr>
-        <w:keepNext/>
+        <w:keepNext w:val="0"/>
         <w:widowControl/>
-        <w:spacing w:before="150" w:after="68" w:line="247" w:lineRule="auto"/>
+        <w:spacing w:before="0" w:after="52" w:line="247" w:lineRule="auto"/>
       </w:pPr>
       <w:r>
         <w:rPr>
@@ -1109,19 +1231,12 @@
           <w:b/>
           <w:i w:val="0"/>
           <w:smallCaps w:val="0"/>
-          <w:color w:val="155C58"/>
-          <w:sz w:val="26"/>
+          <w:color w:val="202729"/>
+          <w:sz w:val="22"/>
           <w:u w:val="none"/>
         </w:rPr>
-        <w:t>Platforms and Tools</w:t>
+        <w:t>AI and product:</w:t>
       </w:r>
-    </w:p>
-    <w:p>
-      <w:pPr>
-        <w:keepNext w:val="0"/>
-        <w:widowControl/>
-        <w:spacing w:before="0" w:after="60" w:line="247" w:lineRule="auto"/>
-      </w:pPr>
       <w:r>
         <w:rPr>
           <w:rFonts w:ascii="Arial" w:hAnsi="Arial" w:cs="Arial" w:eastAsia="Arial"/>
@@ -1132,7 +1247,7 @@
           <w:sz w:val="22"/>
           <w:u w:val="none"/>
         </w:rPr>
-        <w:t>Claude Code; OpenAI Codex; ChatGPT; Git and pull-request review; Google Ads; Meta Ads; GA4; GTM; Looker Studio; Shopify; n8n; Asana.</w:t>
+        <w:t xml:space="preserve"> Claude Code, OpenAI Codex, ChatGPT, MCP servers and APIs, Git and pull-request review, n8n, Asana; product requirements, workflow design, QA and approval controls.</w:t>
       </w:r>
     </w:p>
     <w:p>

</xml_diff>

<commit_message>
Replace internal mechanics with agency-wide use and audit speed
Drops the preview/approve/dispatch/paused detail from the resume, the
homepage and the AdNexus pages. Leads with who uses AdNexus and the
30-minute audit of an unfamiliar account instead.

Co-Authored-By: Claude Opus 5.5 <noreply@anthropic.com>
</commit_message>
<xml_diff>
--- a/downloads/James_Dupre_AI_Strategy_Operations_Master.docx
+++ b/downloads/James_Dupre_AI_Strategy_Operations_Master.docx
@@ -474,7 +474,31 @@
           <w:sz w:val="22"/>
           <w:u w:val="none"/>
         </w:rPr>
-        <w:t>Put every account change behind one gate: preview, approval, live re-check, single dispatch, read-back, audit log and undo. New campaigns and ads are created paused.</w:t>
+        <w:t xml:space="preserve">Designed for the whole agency, with dashboards for strategists, account executives, project managers, creative teams and leadership. A full audit and optimization of an unfamiliar account now takes </w:t>
+      </w:r>
+      <w:r>
+        <w:rPr>
+          <w:rFonts w:ascii="Arial" w:hAnsi="Arial" w:cs="Arial" w:eastAsia="Arial"/>
+          <w:b/>
+          <w:i w:val="0"/>
+          <w:smallCaps w:val="0"/>
+          <w:color w:val="202729"/>
+          <w:sz w:val="22"/>
+          <w:u w:val="none"/>
+        </w:rPr>
+        <w:t>about 30 minutes</w:t>
+      </w:r>
+      <w:r>
+        <w:rPr>
+          <w:rFonts w:ascii="Arial" w:hAnsi="Arial" w:cs="Arial" w:eastAsia="Arial"/>
+          <w:b w:val="0"/>
+          <w:i w:val="0"/>
+          <w:smallCaps w:val="0"/>
+          <w:color w:val="202729"/>
+          <w:sz w:val="22"/>
+          <w:u w:val="none"/>
+        </w:rPr>
+        <w:t>.</w:t>
       </w:r>
     </w:p>
     <w:p>

</xml_diff>

<commit_message>
Resume: replace internal names and process detail with impact
Co-Authored-By: Claude Opus 5.5 <noreply@anthropic.com>
</commit_message>
<xml_diff>
--- a/downloads/James_Dupre_AI_Strategy_Operations_Master.docx
+++ b/downloads/James_Dupre_AI_Strategy_Operations_Master.docx
@@ -333,7 +333,7 @@
           <w:sz w:val="22"/>
           <w:u w:val="none"/>
         </w:rPr>
-        <w:t>Conceived, specified and built AdNexus with Claude Code and Codex. It connects Google Ads, Meta, TikTok, Microsoft Advertising, GA4, Triple Whale, Slack, Asana and meeting notes. Strategists ask in plain English and get a sourced answer, a dashboard or a change ready for approval.</w:t>
+        <w:t>Conceived AdNexus and built it myself with Claude Code and Codex. It brings Google, Meta, TikTok, Microsoft, GA4, Triple Whale, Slack and Asana into one place. Strategists ask in plain English and get a sourced answer, a dashboard or a change ready for approval.</w:t>
       </w:r>
     </w:p>
     <w:p>
@@ -388,7 +388,7 @@
           <w:sz w:val="22"/>
           <w:u w:val="none"/>
         </w:rPr>
-        <w:t xml:space="preserve"> by replacing manual fact-gathering with 18 scheduled monitors and reports, including search-term control, ad-copy and landing-page QA, budget pacing, Meta Investigator and Creative Confidence.</w:t>
+        <w:t>. Eighteen automated checks watch search terms, ad copy, landing pages, budgets and creative performance, and flag only what needs a decision.</w:t>
       </w:r>
     </w:p>
     <w:p>
@@ -419,7 +419,7 @@
           <w:sz w:val="22"/>
           <w:u w:val="none"/>
         </w:rPr>
-        <w:t xml:space="preserve">Shipped </w:t>
+        <w:t xml:space="preserve">Merged </w:t>
       </w:r>
       <w:r>
         <w:rPr>
@@ -431,7 +431,7 @@
           <w:sz w:val="22"/>
           <w:u w:val="none"/>
         </w:rPr>
-        <w:t>860 merged pull requests</w:t>
+        <w:t>860 code changes</w:t>
       </w:r>
       <w:r>
         <w:rPr>
@@ -443,7 +443,7 @@
           <w:sz w:val="22"/>
           <w:u w:val="none"/>
         </w:rPr>
-        <w:t xml:space="preserve"> between July 15 and October 12, 2026, through CI on a protected main branch. Exposed 165 tools to AI assistants through an MCP server, across 34 clients.</w:t>
+        <w:t xml:space="preserve"> in three months. AdNexus now holds 34 client workspaces, and its 165 tools also work inside AI assistants such as Claude, so the team can question live account data.</w:t>
       </w:r>
     </w:p>
     <w:p>
@@ -529,7 +529,7 @@
           <w:sz w:val="22"/>
           <w:u w:val="none"/>
         </w:rPr>
-        <w:t xml:space="preserve">Automated campaign building: </w:t>
+        <w:t xml:space="preserve">Cut campaign build time to </w:t>
       </w:r>
       <w:r>
         <w:rPr>
@@ -553,7 +553,7 @@
           <w:sz w:val="22"/>
           <w:u w:val="none"/>
         </w:rPr>
-        <w:t xml:space="preserve"> versus 2–3 minutes per ad by hand, and Google Performance Max campaigns built in about 2 minutes, ready for launch review.</w:t>
+        <w:t xml:space="preserve"> versus 2–3 minutes per ad by hand, and Google Performance Max campaigns in about 2 minutes.</w:t>
       </w:r>
     </w:p>
     <w:p>
@@ -603,7 +603,31 @@
           <w:sz w:val="22"/>
           <w:u w:val="none"/>
         </w:rPr>
-        <w:t>Created hiring, onboarding and review from scratch: panel interviews, test projects and scorecards, biweekly 1:1s, monthly account audits and a weekly paid-media roundtable.</w:t>
+        <w:t xml:space="preserve">Grew the team from </w:t>
+      </w:r>
+      <w:r>
+        <w:rPr>
+          <w:rFonts w:ascii="Arial" w:hAnsi="Arial" w:cs="Arial" w:eastAsia="Arial"/>
+          <w:b/>
+          <w:i w:val="0"/>
+          <w:smallCaps w:val="0"/>
+          <w:color w:val="202729"/>
+          <w:sz w:val="22"/>
+          <w:u w:val="none"/>
+        </w:rPr>
+        <w:t>one to six strategists</w:t>
+      </w:r>
+      <w:r>
+        <w:rPr>
+          <w:rFonts w:ascii="Arial" w:hAnsi="Arial" w:cs="Arial" w:eastAsia="Arial"/>
+          <w:b w:val="0"/>
+          <w:i w:val="0"/>
+          <w:smallCaps w:val="0"/>
+          <w:color w:val="202729"/>
+          <w:sz w:val="22"/>
+          <w:u w:val="none"/>
+        </w:rPr>
+        <w:t xml:space="preserve"> with a hiring, onboarding and account-review process built from scratch, so quality holds as the client list grows.</w:t>
       </w:r>
     </w:p>
     <w:p>
@@ -689,7 +713,7 @@
           <w:sz w:val="22"/>
           <w:u w:val="none"/>
         </w:rPr>
-        <w:t>Set the team’s AI standard and training path, beginner to advanced: plan the work, get a person’s approval, verify against real account numbers.</w:t>
+        <w:t>Trained the team to use AI on live client work through a beginner-to-advanced program built on real account exercises.</w:t>
       </w:r>
     </w:p>
     <w:p>
@@ -828,7 +852,7 @@
           <w:sz w:val="22"/>
           <w:u w:val="none"/>
         </w:rPr>
-        <w:t xml:space="preserve">Helped lead the elk team behind Compartés’ 2025 holiday campaign, winner of the 2026 Meta Agency Award for Performance Campaign of the Year by a Boutique Agency in North America. Created the $200,000 five-stage Meta budget plan, set the weekly budget steps and wrote the award submission. The campaign delivered </w:t>
+        <w:t xml:space="preserve">Helped lead the elk team behind Compartés’ 2025 holiday campaign, winner of the 2026 Meta Agency Award for Performance Campaign of the Year by a Boutique Agency in North America. Planned the $200,000 Meta budget and its pacing, and wrote the award submission. The campaign delivered </w:t>
       </w:r>
       <w:r>
         <w:rPr>
@@ -933,7 +957,7 @@
           <w:sz w:val="22"/>
           <w:u w:val="none"/>
         </w:rPr>
-        <w:t>Desktop app for directing several AI coding agents on one project. Each agent starts with the project context it needs, a second model can review its work, and nothing is kept without approval.</w:t>
+        <w:t>Desktop app for directing several AI coding agents on one project, with a second model reviewing the work before it is kept.</w:t>
       </w:r>
     </w:p>
     <w:p>
@@ -971,7 +995,7 @@
           <w:sz w:val="22"/>
           <w:u w:val="none"/>
         </w:rPr>
-        <w:t>Private knowledge system for project history, decisions, sources and working rules. New information waits for review before an assistant can rely on it, so context carries across sessions.</w:t>
+        <w:t>Private knowledge system that lets AI assistants pick up any project with its history, decisions and sources, instead of starting from scratch.</w:t>
       </w:r>
     </w:p>
     <w:p>
@@ -990,7 +1014,7 @@
           <w:sz w:val="22"/>
           <w:u w:val="none"/>
         </w:rPr>
-        <w:t>Snipping Tool UL | public Windows app in Rust</w:t>
+        <w:t>Snipping Tool UL | public Windows app</w:t>
       </w:r>
     </w:p>
     <w:p>
@@ -1009,7 +1033,7 @@
           <w:sz w:val="22"/>
           <w:u w:val="none"/>
         </w:rPr>
-        <w:t>Lightweight screenshot and markup tool. A cached-viewport renderer cut preview render time 61% on a 4K image while keeping full-resolution exports.</w:t>
+        <w:t>Fast screenshot and markup tool, built in Rust with AI and released publicly.</w:t>
       </w:r>
     </w:p>
     <w:p>
@@ -1271,7 +1295,7 @@
           <w:sz w:val="22"/>
           <w:u w:val="none"/>
         </w:rPr>
-        <w:t xml:space="preserve"> Claude Code, OpenAI Codex, ChatGPT, MCP servers and APIs, Git and pull-request review, n8n, Asana; product requirements, workflow design, QA and approval controls.</w:t>
+        <w:t xml:space="preserve"> Claude Code, OpenAI Codex, ChatGPT, MCP servers and APIs, Git and pull-request review, n8n, Asana; product requirements, workflow design, AI adoption and training.</w:t>
       </w:r>
     </w:p>
     <w:p>

</xml_diff>